<commit_message>
Frontend per Generazione e conversione file tagliando
Aggiunta sezione con tab per generare, modificare e convertire in pdf modello e autorizzazione del tagliando. È anche possibile caricare l'autorizzazione firmata.
Rimane da fare l'invio delle mail
</commit_message>
<xml_diff>
--- a/to-backend/docx_examples/default_templates/default_contrassegno.docx
+++ b/to-backend/docx_examples/default_templates/default_contrassegno.docx
@@ -13,9 +13,7 @@
           <w:szCs w:val="28"/>
         </w:rPr>
       </w:pPr>
-    </w:p>
-    <w:p>
-      <w:pPr>
+      <w:r>
         <w:rPr>
           <w:rFonts w:ascii="Arial" w:hAnsi="Arial" w:cs="Arial"/>
           <w:b/>
@@ -24,7 +22,8 @@
           <w:sz w:val="28"/>
           <w:szCs w:val="28"/>
         </w:rPr>
-      </w:pPr>
+        <w:t>Tagliando {#</w:t>
+      </w:r>
       <w:r>
         <w:rPr>
           <w:rFonts w:ascii="Arial" w:hAnsi="Arial" w:cs="Arial"/>
@@ -34,7 +33,7 @@
           <w:sz w:val="28"/>
           <w:szCs w:val="28"/>
         </w:rPr>
-        <w:t>Tagliando {#</w:t>
+        <w:t>numeroTagliandoStr</w:t>
       </w:r>
       <w:r>
         <w:rPr>
@@ -45,7 +44,7 @@
           <w:sz w:val="28"/>
           <w:szCs w:val="28"/>
         </w:rPr>
-        <w:t>numeroTagliandoStr</w:t>
+        <w:t>#}</w:t>
       </w:r>
       <w:r>
         <w:rPr>
@@ -56,6 +55,66 @@
           <w:sz w:val="28"/>
           <w:szCs w:val="28"/>
         </w:rPr>
+        <w:br/>
+      </w:r>
+      <w:r>
+        <w:rPr>
+          <w:rFonts w:ascii="Arial" w:hAnsi="Arial" w:cs="Arial"/>
+          <w:b/>
+          <w:bCs/>
+          <w:sz w:val="28"/>
+          <w:szCs w:val="28"/>
+        </w:rPr>
+        <w:t>Per</w:t>
+      </w:r>
+      <w:r>
+        <w:rPr>
+          <w:rFonts w:ascii="Arial" w:hAnsi="Arial" w:cs="Arial"/>
+          <w:b/>
+          <w:bCs/>
+          <w:sz w:val="28"/>
+          <w:szCs w:val="28"/>
+        </w:rPr>
+        <w:t>:</w:t>
+      </w:r>
+      <w:r>
+        <w:rPr>
+          <w:rFonts w:ascii="Arial" w:hAnsi="Arial" w:cs="Arial"/>
+          <w:b/>
+          <w:bCs/>
+          <w:sz w:val="28"/>
+          <w:szCs w:val="28"/>
+        </w:rPr>
+        <w:t xml:space="preserve"> </w:t>
+      </w:r>
+      <w:r>
+        <w:rPr>
+          <w:rFonts w:ascii="Arial" w:hAnsi="Arial" w:cs="Arial"/>
+          <w:b/>
+          <w:bCs/>
+          <w:sz w:val="28"/>
+          <w:szCs w:val="28"/>
+        </w:rPr>
+        <w:t>{#</w:t>
+      </w:r>
+      <w:r>
+        <w:rPr>
+          <w:rFonts w:ascii="Arial" w:hAnsi="Arial" w:cs="Arial"/>
+          <w:b/>
+          <w:bCs/>
+          <w:sz w:val="28"/>
+          <w:szCs w:val="28"/>
+        </w:rPr>
+        <w:t>descrizionePermessoStr</w:t>
+      </w:r>
+      <w:r>
+        <w:rPr>
+          <w:rFonts w:ascii="Arial" w:hAnsi="Arial" w:cs="Arial"/>
+          <w:b/>
+          <w:bCs/>
+          <w:sz w:val="28"/>
+          <w:szCs w:val="28"/>
+        </w:rPr>
         <w:t>#}</w:t>
       </w:r>
       <w:r>
@@ -63,7 +122,6 @@
           <w:rFonts w:ascii="Arial" w:hAnsi="Arial" w:cs="Arial"/>
           <w:b/>
           <w:bCs/>
-          <w:noProof/>
           <w:sz w:val="28"/>
           <w:szCs w:val="28"/>
         </w:rPr>
@@ -77,7 +135,27 @@
           <w:sz w:val="28"/>
           <w:szCs w:val="28"/>
         </w:rPr>
-        <w:t>Per</w:t>
+        <w:t>T</w:t>
+      </w:r>
+      <w:r>
+        <w:rPr>
+          <w:rFonts w:ascii="Arial" w:hAnsi="Arial" w:cs="Arial"/>
+          <w:b/>
+          <w:bCs/>
+          <w:sz w:val="28"/>
+          <w:szCs w:val="28"/>
+        </w:rPr>
+        <w:t>arghe</w:t>
+      </w:r>
+      <w:r>
+        <w:rPr>
+          <w:rFonts w:ascii="Arial" w:hAnsi="Arial" w:cs="Arial"/>
+          <w:b/>
+          <w:bCs/>
+          <w:sz w:val="28"/>
+          <w:szCs w:val="28"/>
+        </w:rPr>
+        <w:t xml:space="preserve"> autorizzate</w:t>
       </w:r>
       <w:r>
         <w:rPr>
@@ -117,7 +195,7 @@
           <w:sz w:val="28"/>
           <w:szCs w:val="28"/>
         </w:rPr>
-        <w:t>descrizionePermessoStr</w:t>
+        <w:t>FOR targaObj IN targheArr</w:t>
       </w:r>
       <w:r>
         <w:rPr>
@@ -137,6 +215,106 @@
           <w:sz w:val="28"/>
           <w:szCs w:val="28"/>
         </w:rPr>
+        <w:t xml:space="preserve"> </w:t>
+      </w:r>
+      <w:r>
+        <w:rPr>
+          <w:rFonts w:ascii="Arial" w:hAnsi="Arial" w:cs="Arial"/>
+          <w:b/>
+          <w:bCs/>
+          <w:sz w:val="28"/>
+          <w:szCs w:val="28"/>
+        </w:rPr>
+        <w:t>{#$idx</w:t>
+      </w:r>
+      <w:r>
+        <w:rPr>
+          <w:rFonts w:ascii="Arial" w:hAnsi="Arial" w:cs="Arial"/>
+          <w:b/>
+          <w:bCs/>
+          <w:sz w:val="28"/>
+          <w:szCs w:val="28"/>
+        </w:rPr>
+        <w:t xml:space="preserve"> + 1</w:t>
+      </w:r>
+      <w:r>
+        <w:rPr>
+          <w:rFonts w:ascii="Arial" w:hAnsi="Arial" w:cs="Arial"/>
+          <w:b/>
+          <w:bCs/>
+          <w:sz w:val="28"/>
+          <w:szCs w:val="28"/>
+        </w:rPr>
+        <w:t>#}</w:t>
+      </w:r>
+      <w:r>
+        <w:rPr>
+          <w:rFonts w:ascii="Arial" w:hAnsi="Arial" w:cs="Arial"/>
+          <w:b/>
+          <w:bCs/>
+          <w:sz w:val="28"/>
+          <w:szCs w:val="28"/>
+        </w:rPr>
+        <w:t>)</w:t>
+      </w:r>
+      <w:r>
+        <w:rPr>
+          <w:rFonts w:ascii="Arial" w:hAnsi="Arial" w:cs="Arial"/>
+          <w:b/>
+          <w:bCs/>
+          <w:sz w:val="28"/>
+          <w:szCs w:val="28"/>
+        </w:rPr>
+        <w:t xml:space="preserve">: </w:t>
+      </w:r>
+      <w:r>
+        <w:rPr>
+          <w:rFonts w:ascii="Arial" w:hAnsi="Arial" w:cs="Arial"/>
+          <w:b/>
+          <w:bCs/>
+          <w:sz w:val="28"/>
+          <w:szCs w:val="28"/>
+        </w:rPr>
+        <w:t>{#</w:t>
+      </w:r>
+      <w:r>
+        <w:rPr>
+          <w:rFonts w:ascii="Arial" w:hAnsi="Arial" w:cs="Arial"/>
+          <w:b/>
+          <w:bCs/>
+          <w:sz w:val="28"/>
+          <w:szCs w:val="28"/>
+        </w:rPr>
+        <w:t>INS $targaObj.targaStr</w:t>
+      </w:r>
+      <w:r>
+        <w:rPr>
+          <w:rFonts w:ascii="Arial" w:hAnsi="Arial" w:cs="Arial"/>
+          <w:b/>
+          <w:bCs/>
+          <w:sz w:val="28"/>
+          <w:szCs w:val="28"/>
+        </w:rPr>
+        <w:t>#}</w:t>
+      </w:r>
+      <w:r>
+        <w:rPr>
+          <w:rFonts w:ascii="Arial" w:hAnsi="Arial" w:cs="Arial"/>
+          <w:b/>
+          <w:bCs/>
+          <w:sz w:val="28"/>
+          <w:szCs w:val="28"/>
+        </w:rPr>
+        <w:t xml:space="preserve"> </w:t>
+      </w:r>
+      <w:r>
+        <w:rPr>
+          <w:rFonts w:ascii="Arial" w:hAnsi="Arial" w:cs="Arial"/>
+          <w:b/>
+          <w:bCs/>
+          <w:sz w:val="28"/>
+          <w:szCs w:val="28"/>
+        </w:rPr>
         <w:br/>
       </w:r>
       <w:r>
@@ -147,56 +325,6 @@
           <w:sz w:val="28"/>
           <w:szCs w:val="28"/>
         </w:rPr>
-        <w:t>T</w:t>
-      </w:r>
-      <w:r>
-        <w:rPr>
-          <w:rFonts w:ascii="Arial" w:hAnsi="Arial" w:cs="Arial"/>
-          <w:b/>
-          <w:bCs/>
-          <w:sz w:val="28"/>
-          <w:szCs w:val="28"/>
-        </w:rPr>
-        <w:t>arghe</w:t>
-      </w:r>
-      <w:r>
-        <w:rPr>
-          <w:rFonts w:ascii="Arial" w:hAnsi="Arial" w:cs="Arial"/>
-          <w:b/>
-          <w:bCs/>
-          <w:sz w:val="28"/>
-          <w:szCs w:val="28"/>
-        </w:rPr>
-        <w:t xml:space="preserve"> autorizzate</w:t>
-      </w:r>
-      <w:r>
-        <w:rPr>
-          <w:rFonts w:ascii="Arial" w:hAnsi="Arial" w:cs="Arial"/>
-          <w:b/>
-          <w:bCs/>
-          <w:sz w:val="28"/>
-          <w:szCs w:val="28"/>
-        </w:rPr>
-        <w:t>:</w:t>
-      </w:r>
-      <w:r>
-        <w:rPr>
-          <w:rFonts w:ascii="Arial" w:hAnsi="Arial" w:cs="Arial"/>
-          <w:b/>
-          <w:bCs/>
-          <w:sz w:val="28"/>
-          <w:szCs w:val="28"/>
-        </w:rPr>
-        <w:t xml:space="preserve"> </w:t>
-      </w:r>
-      <w:r>
-        <w:rPr>
-          <w:rFonts w:ascii="Arial" w:hAnsi="Arial" w:cs="Arial"/>
-          <w:b/>
-          <w:bCs/>
-          <w:sz w:val="28"/>
-          <w:szCs w:val="28"/>
-        </w:rPr>
         <w:t>{#</w:t>
       </w:r>
       <w:r>
@@ -207,206 +335,8 @@
           <w:sz w:val="28"/>
           <w:szCs w:val="28"/>
         </w:rPr>
-        <w:t xml:space="preserve">FOR </w:t>
-      </w:r>
-      <w:proofErr w:type="spellStart"/>
-      <w:r>
-        <w:rPr>
-          <w:rFonts w:ascii="Arial" w:hAnsi="Arial" w:cs="Arial"/>
-          <w:b/>
-          <w:bCs/>
-          <w:sz w:val="28"/>
-          <w:szCs w:val="28"/>
-        </w:rPr>
-        <w:t>targaObj</w:t>
-      </w:r>
-      <w:proofErr w:type="spellEnd"/>
-      <w:r>
-        <w:rPr>
-          <w:rFonts w:ascii="Arial" w:hAnsi="Arial" w:cs="Arial"/>
-          <w:b/>
-          <w:bCs/>
-          <w:sz w:val="28"/>
-          <w:szCs w:val="28"/>
-        </w:rPr>
-        <w:t xml:space="preserve"> IN </w:t>
-      </w:r>
-      <w:proofErr w:type="spellStart"/>
-      <w:r>
-        <w:rPr>
-          <w:rFonts w:ascii="Arial" w:hAnsi="Arial" w:cs="Arial"/>
-          <w:b/>
-          <w:bCs/>
-          <w:sz w:val="28"/>
-          <w:szCs w:val="28"/>
-        </w:rPr>
-        <w:t>targheArr</w:t>
-      </w:r>
-      <w:proofErr w:type="spellEnd"/>
-      <w:r>
-        <w:rPr>
-          <w:rFonts w:ascii="Arial" w:hAnsi="Arial" w:cs="Arial"/>
-          <w:b/>
-          <w:bCs/>
-          <w:sz w:val="28"/>
-          <w:szCs w:val="28"/>
-        </w:rPr>
-        <w:t>#}</w:t>
-      </w:r>
-      <w:r>
-        <w:rPr>
-          <w:rFonts w:ascii="Arial" w:hAnsi="Arial" w:cs="Arial"/>
-          <w:b/>
-          <w:bCs/>
-          <w:sz w:val="28"/>
-          <w:szCs w:val="28"/>
-        </w:rPr>
-        <w:t xml:space="preserve"> </w:t>
-      </w:r>
-      <w:r>
-        <w:rPr>
-          <w:rFonts w:ascii="Arial" w:hAnsi="Arial" w:cs="Arial"/>
-          <w:b/>
-          <w:bCs/>
-          <w:sz w:val="28"/>
-          <w:szCs w:val="28"/>
-        </w:rPr>
-        <w:t>{#$idx</w:t>
-      </w:r>
-      <w:r>
-        <w:rPr>
-          <w:rFonts w:ascii="Arial" w:hAnsi="Arial" w:cs="Arial"/>
-          <w:b/>
-          <w:bCs/>
-          <w:sz w:val="28"/>
-          <w:szCs w:val="28"/>
-        </w:rPr>
-        <w:t xml:space="preserve"> + 1</w:t>
-      </w:r>
-      <w:r>
-        <w:rPr>
-          <w:rFonts w:ascii="Arial" w:hAnsi="Arial" w:cs="Arial"/>
-          <w:b/>
-          <w:bCs/>
-          <w:sz w:val="28"/>
-          <w:szCs w:val="28"/>
-        </w:rPr>
-        <w:t>#}</w:t>
-      </w:r>
-      <w:r>
-        <w:rPr>
-          <w:rFonts w:ascii="Arial" w:hAnsi="Arial" w:cs="Arial"/>
-          <w:b/>
-          <w:bCs/>
-          <w:sz w:val="28"/>
-          <w:szCs w:val="28"/>
-        </w:rPr>
-        <w:t>)</w:t>
-      </w:r>
-      <w:r>
-        <w:rPr>
-          <w:rFonts w:ascii="Arial" w:hAnsi="Arial" w:cs="Arial"/>
-          <w:b/>
-          <w:bCs/>
-          <w:sz w:val="28"/>
-          <w:szCs w:val="28"/>
-        </w:rPr>
-        <w:t xml:space="preserve">: </w:t>
-      </w:r>
-      <w:r>
-        <w:rPr>
-          <w:rFonts w:ascii="Arial" w:hAnsi="Arial" w:cs="Arial"/>
-          <w:b/>
-          <w:bCs/>
-          <w:sz w:val="28"/>
-          <w:szCs w:val="28"/>
-        </w:rPr>
-        <w:t>{#</w:t>
-      </w:r>
-      <w:r>
-        <w:rPr>
-          <w:rFonts w:ascii="Arial" w:hAnsi="Arial" w:cs="Arial"/>
-          <w:b/>
-          <w:bCs/>
-          <w:sz w:val="28"/>
-          <w:szCs w:val="28"/>
-        </w:rPr>
-        <w:t>INS $</w:t>
-      </w:r>
-      <w:proofErr w:type="spellStart"/>
-      <w:r>
-        <w:rPr>
-          <w:rFonts w:ascii="Arial" w:hAnsi="Arial" w:cs="Arial"/>
-          <w:b/>
-          <w:bCs/>
-          <w:sz w:val="28"/>
-          <w:szCs w:val="28"/>
-        </w:rPr>
-        <w:t>targaObj.targaStr</w:t>
-      </w:r>
-      <w:proofErr w:type="spellEnd"/>
-      <w:r>
-        <w:rPr>
-          <w:rFonts w:ascii="Arial" w:hAnsi="Arial" w:cs="Arial"/>
-          <w:b/>
-          <w:bCs/>
-          <w:sz w:val="28"/>
-          <w:szCs w:val="28"/>
-        </w:rPr>
-        <w:t>#}</w:t>
-      </w:r>
-      <w:r>
-        <w:rPr>
-          <w:rFonts w:ascii="Arial" w:hAnsi="Arial" w:cs="Arial"/>
-          <w:b/>
-          <w:bCs/>
-          <w:sz w:val="28"/>
-          <w:szCs w:val="28"/>
-        </w:rPr>
-        <w:t xml:space="preserve"> </w:t>
-      </w:r>
-      <w:r>
-        <w:rPr>
-          <w:rFonts w:ascii="Arial" w:hAnsi="Arial" w:cs="Arial"/>
-          <w:b/>
-          <w:bCs/>
-          <w:sz w:val="28"/>
-          <w:szCs w:val="28"/>
-        </w:rPr>
-        <w:br/>
-      </w:r>
-      <w:r>
-        <w:rPr>
-          <w:rFonts w:ascii="Arial" w:hAnsi="Arial" w:cs="Arial"/>
-          <w:b/>
-          <w:bCs/>
-          <w:sz w:val="28"/>
-          <w:szCs w:val="28"/>
-        </w:rPr>
-        <w:t>{#</w:t>
-      </w:r>
-      <w:r>
-        <w:rPr>
-          <w:rFonts w:ascii="Arial" w:hAnsi="Arial" w:cs="Arial"/>
-          <w:b/>
-          <w:bCs/>
-          <w:sz w:val="28"/>
-          <w:szCs w:val="28"/>
-        </w:rPr>
-        <w:t xml:space="preserve">END-FOR </w:t>
-      </w:r>
-      <w:proofErr w:type="spellStart"/>
-      <w:r>
-        <w:rPr>
-          <w:rFonts w:ascii="Arial" w:hAnsi="Arial" w:cs="Arial"/>
-          <w:b/>
-          <w:bCs/>
-          <w:sz w:val="28"/>
-          <w:szCs w:val="28"/>
-        </w:rPr>
-        <w:t>targaObj</w:t>
-      </w:r>
-      <w:proofErr w:type="spellEnd"/>
+        <w:t>END-FOR targaObj</w:t>
+      </w:r>
       <w:r>
         <w:rPr>
           <w:rFonts w:ascii="Arial" w:hAnsi="Arial" w:cs="Arial"/>
@@ -513,35 +443,26 @@
         <w:rPr>
           <w:rFonts w:ascii="Arial" w:hAnsi="Arial" w:cs="Arial"/>
         </w:rPr>
-        <w:t xml:space="preserve">{#IMAGE </w:t>
-      </w:r>
-      <w:proofErr w:type="spellStart"/>
-      <w:r>
-        <w:rPr>
-          <w:rFonts w:ascii="Arial" w:hAnsi="Arial" w:cs="Arial"/>
-        </w:rPr>
-        <w:t>qrCode</w:t>
-      </w:r>
-      <w:proofErr w:type="spellEnd"/>
-      <w:r>
-        <w:rPr>
-          <w:rFonts w:ascii="Arial" w:hAnsi="Arial" w:cs="Arial"/>
-        </w:rPr>
-        <w:t>(</w:t>
-      </w:r>
-      <w:proofErr w:type="spellStart"/>
+        <w:t>{#IMAGE qrCode(verificationUrl)#}</w:t>
+      </w:r>
+      <w:r>
+        <w:rPr>
+          <w:rFonts w:ascii="Arial" w:hAnsi="Arial" w:cs="Arial"/>
+        </w:rPr>
+        <w:br/>
+        <w:t>{#</w:t>
+      </w:r>
       <w:r>
         <w:rPr>
           <w:rFonts w:ascii="Arial" w:hAnsi="Arial" w:cs="Arial"/>
         </w:rPr>
         <w:t>verificationUrl</w:t>
       </w:r>
-      <w:proofErr w:type="spellEnd"/>
-      <w:r>
-        <w:rPr>
-          <w:rFonts w:ascii="Arial" w:hAnsi="Arial" w:cs="Arial"/>
-        </w:rPr>
-        <w:t>)#}</w:t>
+      <w:r>
+        <w:rPr>
+          <w:rFonts w:ascii="Arial" w:hAnsi="Arial" w:cs="Arial"/>
+        </w:rPr>
+        <w:t>#}</w:t>
       </w:r>
     </w:p>
     <w:p>
@@ -1449,6 +1370,7 @@
   <w:style w:type="character" w:default="1" w:styleId="Carpredefinitoparagrafo">
     <w:name w:val="Default Paragraph Font"/>
     <w:uiPriority w:val="1"/>
+    <w:semiHidden/>
     <w:unhideWhenUsed/>
   </w:style>
   <w:style w:type="table" w:default="1" w:styleId="Tabellanormale">

</xml_diff>